<commit_message>
docs: authors, repo link, public date, company addresses; stop tracking test screenshots
Co-Authored-By: Claude Sonnet 5.5 <noreply@anthropic.com>
</commit_message>
<xml_diff>
--- a/docs/submission/Invention_Disclosure_Form_FILLED.docx
+++ b/docs/submission/Invention_Disclosure_Form_FILLED.docx
@@ -4769,7 +4769,7 @@
               </w:rPr>
             </w:pPr>
             <w:r>
-              <w:t>[YOU: add the repository link.]</w:t>
+              <w:t>Repository: https://github.com/Haise-727/portlogi</w:t>
             </w:r>
           </w:p>
         </w:tc>
@@ -5117,7 +5117,7 @@
               <w:pStyle w:val="TableParagraph"/>
             </w:pPr>
             <w:r>
-              <w:t>The demo site is on the public internet at https://psjkcvqmjxpwimkenx7bbmsfky0fxqmj.lambda-url.ap-south-1.on.aws/ . [YOU: add the date it was first public. No paper has been published.]</w:t>
+              <w:t>The demo site went online on AWS on about 13 October 2026 at https://psjkcvqmjxpwimkenx7bbmsfky0fxqmj.lambda-url.ap-south-1.on.aws/ . No paper or article has been published. The code is on GitHub at https://github.com/Haise-727/portlogi .</w:t>
             </w:r>
           </w:p>
         </w:tc>
@@ -6875,7 +6875,7 @@
               </w:rPr>
             </w:pPr>
             <w:r>
-              <w:t>3. PSA SICAL Terminals, Thoothukudi. [YOU: add address.]</w:t>
+              <w:t>3. DP World Nhava Sheva (NSIGT), Operation Centre, Sheva, Navi Mumbai 400707, Maharashtra, India.</w:t>
             </w:r>
           </w:p>
           <w:p>
@@ -6888,7 +6888,7 @@
               </w:rPr>
             </w:pPr>
             <w:r>
-              <w:t>4. DP World, Nhava Sheva. [YOU: add address.]</w:t>
+              <w:t>4. Gujarat Pipavav Port Limited (APM Terminals Pipavav), registered office: Post Office Rampara No. 2, Via Rajula, District Amreli, Gujarat 365560, India. Corporate office: 504, 5th Floor, Godrej Two, Pirojshanagar, Vikhroli East, Mumbai 400079.</w:t>
             </w:r>
           </w:p>
           <w:p>
@@ -6901,7 +6901,7 @@
               </w:rPr>
             </w:pPr>
             <w:r>
-              <w:t>5. APM Terminals Pipavav. [YOU: add address.]</w:t>
+              <w:t>5. PSA SICAL Terminals, Tuticorin Container Terminal Building, Berth No. 7, Harbour Estate, Thoothukudi 628004, Tamil Nadu, India. (Address from a business directory, not an official page.)</w:t>
             </w:r>
           </w:p>
         </w:tc>
@@ -7865,7 +7865,7 @@
               <w:pStyle w:val="TableParagraph"/>
             </w:pPr>
             <w:r>
-              <w:t>[YOU: names, register numbers, department and role of each team member. All are from VIT Chennai, so the No Objection Certificate for outside inventors is not needed. If anyone is from outside, they must sign it.]</w:t>
+              <w:t>Harsha Vardan M Sakamuri and Akshathra Selvam. Both are from VIT Chennai, so the No Objection Certificate for outside inventors is not needed.</w:t>
             </w:r>
           </w:p>
         </w:tc>

</xml_diff>

<commit_message>
docs: tidy company list in form
Co-Authored-By: Claude Sonnet 5.5 <noreply@anthropic.com>
</commit_message>
<xml_diff>
--- a/docs/submission/Invention_Disclosure_Form_FILLED.docx
+++ b/docs/submission/Invention_Disclosure_Form_FILLED.docx
@@ -6754,90 +6754,6 @@
                 <w:sz w:val="24"/>
               </w:rPr>
             </w:pPr>
-          </w:p>
-          <w:p>
-            <w:pPr>
-              <w:pStyle w:val="TableParagraph"/>
-              <w:ind w:left="115"/>
-              <w:rPr>
-                <w:sz w:val="24"/>
-              </w:rPr>
-            </w:pPr>
-            <w:r>
-              <w:rPr>
-                <w:spacing w:val="-5"/>
-                <w:sz w:val="24"/>
-              </w:rPr>
-              <w:t>1.</w:t>
-            </w:r>
-          </w:p>
-          <w:p>
-            <w:pPr>
-              <w:pStyle w:val="TableParagraph"/>
-              <w:spacing w:before="41"/>
-              <w:ind w:left="115"/>
-              <w:rPr>
-                <w:sz w:val="24"/>
-              </w:rPr>
-            </w:pPr>
-            <w:r>
-              <w:rPr>
-                <w:spacing w:val="-5"/>
-                <w:sz w:val="24"/>
-              </w:rPr>
-              <w:t>2.</w:t>
-            </w:r>
-          </w:p>
-          <w:p>
-            <w:pPr>
-              <w:pStyle w:val="TableParagraph"/>
-              <w:spacing w:before="41"/>
-              <w:ind w:left="115"/>
-              <w:rPr>
-                <w:sz w:val="24"/>
-              </w:rPr>
-            </w:pPr>
-            <w:r>
-              <w:rPr>
-                <w:spacing w:val="-5"/>
-                <w:sz w:val="24"/>
-              </w:rPr>
-              <w:t>3.</w:t>
-            </w:r>
-          </w:p>
-          <w:p>
-            <w:pPr>
-              <w:pStyle w:val="TableParagraph"/>
-              <w:spacing w:before="41"/>
-              <w:ind w:left="115"/>
-              <w:rPr>
-                <w:sz w:val="24"/>
-              </w:rPr>
-            </w:pPr>
-            <w:r>
-              <w:rPr>
-                <w:spacing w:val="-5"/>
-                <w:sz w:val="24"/>
-              </w:rPr>
-              <w:t>4.</w:t>
-            </w:r>
-          </w:p>
-          <w:p>
-            <w:pPr>
-              <w:pStyle w:val="TableParagraph"/>
-              <w:spacing w:before="40"/>
-              <w:ind w:left="115"/>
-              <w:rPr>
-                <w:sz w:val="24"/>
-              </w:rPr>
-            </w:pPr>
-            <w:r>
-              <w:rPr>
-                <w:spacing w:val="-5"/>
-                <w:sz w:val="24"/>
-              </w:rPr>
-              <w:t>5.</w:t>
-            </w:r>
           </w:p>
           <w:p>
             <w:pPr>

</xml_diff>